<commit_message>
Dos funciones trabajan juntas
</commit_message>
<xml_diff>
--- a/docs/Actividades Modulo 2.docx
+++ b/docs/Actividades Modulo 2.docx
@@ -291,6 +291,108 @@
         </w:drawing>
       </w:r>
     </w:p>
+    <w:p>
+      <w:r>
+        <w:drawing>
+          <wp:inline distT="0" distB="0" distL="0" distR="0" wp14:anchorId="7481FEA1" wp14:editId="7B1CE88F">
+            <wp:extent cx="5731510" cy="3075305"/>
+            <wp:effectExtent l="0" t="0" r="2540" b="0"/>
+            <wp:docPr id="31850562" name="Picture 1"/>
+            <wp:cNvGraphicFramePr>
+              <a:graphicFrameLocks xmlns:a="http://schemas.openxmlformats.org/drawingml/2006/main" noChangeAspect="1"/>
+            </wp:cNvGraphicFramePr>
+            <a:graphic xmlns:a="http://schemas.openxmlformats.org/drawingml/2006/main">
+              <a:graphicData uri="http://schemas.openxmlformats.org/drawingml/2006/picture">
+                <pic:pic xmlns:pic="http://schemas.openxmlformats.org/drawingml/2006/picture">
+                  <pic:nvPicPr>
+                    <pic:cNvPr id="31850562" name=""/>
+                    <pic:cNvPicPr/>
+                  </pic:nvPicPr>
+                  <pic:blipFill>
+                    <a:blip r:embed="rId11"/>
+                    <a:stretch>
+                      <a:fillRect/>
+                    </a:stretch>
+                  </pic:blipFill>
+                  <pic:spPr>
+                    <a:xfrm>
+                      <a:off x="0" y="0"/>
+                      <a:ext cx="5731510" cy="3075305"/>
+                    </a:xfrm>
+                    <a:prstGeom prst="rect">
+                      <a:avLst/>
+                    </a:prstGeom>
+                  </pic:spPr>
+                </pic:pic>
+              </a:graphicData>
+            </a:graphic>
+          </wp:inline>
+        </w:drawing>
+      </w:r>
+    </w:p>
+    <w:p/>
+    <w:p/>
+    <w:p/>
+    <w:p/>
+    <w:p/>
+    <w:p/>
+    <w:p/>
+    <w:p>
+      <w:pPr>
+        <w:rPr>
+          <w:b/>
+          <w:bCs/>
+        </w:rPr>
+      </w:pPr>
+      <w:r>
+        <w:rPr>
+          <w:b/>
+          <w:bCs/>
+        </w:rPr>
+        <w:lastRenderedPageBreak/>
+        <w:t>Dos funciones que trabajan juntas</w:t>
+      </w:r>
+    </w:p>
+    <w:p>
+      <w:r>
+        <w:drawing>
+          <wp:inline distT="0" distB="0" distL="0" distR="0" wp14:anchorId="292ED43E" wp14:editId="27AFA0AC">
+            <wp:extent cx="5731510" cy="2756535"/>
+            <wp:effectExtent l="0" t="0" r="2540" b="5715"/>
+            <wp:docPr id="1687731067" name="Picture 1"/>
+            <wp:cNvGraphicFramePr>
+              <a:graphicFrameLocks xmlns:a="http://schemas.openxmlformats.org/drawingml/2006/main" noChangeAspect="1"/>
+            </wp:cNvGraphicFramePr>
+            <a:graphic xmlns:a="http://schemas.openxmlformats.org/drawingml/2006/main">
+              <a:graphicData uri="http://schemas.openxmlformats.org/drawingml/2006/picture">
+                <pic:pic xmlns:pic="http://schemas.openxmlformats.org/drawingml/2006/picture">
+                  <pic:nvPicPr>
+                    <pic:cNvPr id="1687731067" name=""/>
+                    <pic:cNvPicPr/>
+                  </pic:nvPicPr>
+                  <pic:blipFill>
+                    <a:blip r:embed="rId12"/>
+                    <a:stretch>
+                      <a:fillRect/>
+                    </a:stretch>
+                  </pic:blipFill>
+                  <pic:spPr>
+                    <a:xfrm>
+                      <a:off x="0" y="0"/>
+                      <a:ext cx="5731510" cy="2756535"/>
+                    </a:xfrm>
+                    <a:prstGeom prst="rect">
+                      <a:avLst/>
+                    </a:prstGeom>
+                  </pic:spPr>
+                </pic:pic>
+              </a:graphicData>
+            </a:graphic>
+          </wp:inline>
+        </w:drawing>
+      </w:r>
+    </w:p>
+    <w:p/>
     <w:sectPr>
       <w:pgSz w:w="11906" w:h="16838"/>
       <w:pgMar w:top="1440" w:right="1440" w:bottom="1440" w:left="1440" w:header="720" w:footer="720" w:gutter="0"/>
@@ -752,7 +854,6 @@
     <w:next w:val="Normal"/>
     <w:link w:val="Heading3Char"/>
     <w:uiPriority w:val="9"/>
-    <w:semiHidden/>
     <w:unhideWhenUsed/>
     <w:qFormat/>
     <w:rsid w:val="00C7007C"/>
@@ -904,7 +1005,6 @@
   <w:style w:type="character" w:default="1" w:styleId="DefaultParagraphFont">
     <w:name w:val="Default Paragraph Font"/>
     <w:uiPriority w:val="1"/>
-    <w:semiHidden/>
     <w:unhideWhenUsed/>
   </w:style>
   <w:style w:type="table" w:default="1" w:styleId="TableNormal">
@@ -960,7 +1060,6 @@
     <w:basedOn w:val="DefaultParagraphFont"/>
     <w:link w:val="Heading3"/>
     <w:uiPriority w:val="9"/>
-    <w:semiHidden/>
     <w:rsid w:val="00C7007C"/>
     <w:rPr>
       <w:rFonts w:eastAsiaTheme="majorEastAsia" w:cstheme="majorBidi"/>

</xml_diff>

<commit_message>
actualizacion de documentacion para modulo 2
actualizacion de documentacion para modulo 2
</commit_message>
<xml_diff>
--- a/docs/Actividades Modulo 2.docx
+++ b/docs/Actividades Modulo 2.docx
@@ -350,7 +350,39 @@
           <w:bCs/>
         </w:rPr>
         <w:lastRenderedPageBreak/>
-        <w:t>Dos funciones que trabajan juntas</w:t>
+        <w:t xml:space="preserve">Dos </w:t>
+      </w:r>
+      <w:proofErr w:type="spellStart"/>
+      <w:r>
+        <w:rPr>
+          <w:b/>
+          <w:bCs/>
+        </w:rPr>
+        <w:t>funciones</w:t>
+      </w:r>
+      <w:proofErr w:type="spellEnd"/>
+      <w:r>
+        <w:rPr>
+          <w:b/>
+          <w:bCs/>
+        </w:rPr>
+        <w:t xml:space="preserve"> que </w:t>
+      </w:r>
+      <w:proofErr w:type="spellStart"/>
+      <w:r>
+        <w:rPr>
+          <w:b/>
+          <w:bCs/>
+        </w:rPr>
+        <w:t>trabajan</w:t>
+      </w:r>
+      <w:proofErr w:type="spellEnd"/>
+      <w:r>
+        <w:rPr>
+          <w:b/>
+          <w:bCs/>
+        </w:rPr>
+        <w:t xml:space="preserve"> juntas</w:t>
       </w:r>
     </w:p>
     <w:p>
@@ -459,6 +491,204 @@
                     <a:xfrm>
                       <a:off x="0" y="0"/>
                       <a:ext cx="5731510" cy="3187700"/>
+                    </a:xfrm>
+                    <a:prstGeom prst="rect">
+                      <a:avLst/>
+                    </a:prstGeom>
+                  </pic:spPr>
+                </pic:pic>
+              </a:graphicData>
+            </a:graphic>
+          </wp:inline>
+        </w:drawing>
+      </w:r>
+    </w:p>
+    <w:p>
+      <w:r>
+        <w:drawing>
+          <wp:inline distT="0" distB="0" distL="0" distR="0" wp14:anchorId="629B6913" wp14:editId="2D23AFA7">
+            <wp:extent cx="5731510" cy="3228975"/>
+            <wp:effectExtent l="0" t="0" r="2540" b="9525"/>
+            <wp:docPr id="337405502" name="Picture 1"/>
+            <wp:cNvGraphicFramePr>
+              <a:graphicFrameLocks xmlns:a="http://schemas.openxmlformats.org/drawingml/2006/main" noChangeAspect="1"/>
+            </wp:cNvGraphicFramePr>
+            <a:graphic xmlns:a="http://schemas.openxmlformats.org/drawingml/2006/main">
+              <a:graphicData uri="http://schemas.openxmlformats.org/drawingml/2006/picture">
+                <pic:pic xmlns:pic="http://schemas.openxmlformats.org/drawingml/2006/picture">
+                  <pic:nvPicPr>
+                    <pic:cNvPr id="337405502" name=""/>
+                    <pic:cNvPicPr/>
+                  </pic:nvPicPr>
+                  <pic:blipFill>
+                    <a:blip r:embed="rId15"/>
+                    <a:stretch>
+                      <a:fillRect/>
+                    </a:stretch>
+                  </pic:blipFill>
+                  <pic:spPr>
+                    <a:xfrm>
+                      <a:off x="0" y="0"/>
+                      <a:ext cx="5731510" cy="3228975"/>
+                    </a:xfrm>
+                    <a:prstGeom prst="rect">
+                      <a:avLst/>
+                    </a:prstGeom>
+                  </pic:spPr>
+                </pic:pic>
+              </a:graphicData>
+            </a:graphic>
+          </wp:inline>
+        </w:drawing>
+      </w:r>
+    </w:p>
+    <w:p>
+      <w:r>
+        <w:lastRenderedPageBreak/>
+        <w:drawing>
+          <wp:inline distT="0" distB="0" distL="0" distR="0" wp14:anchorId="28A961CB" wp14:editId="36BD7CC3">
+            <wp:extent cx="5731510" cy="3093720"/>
+            <wp:effectExtent l="0" t="0" r="2540" b="0"/>
+            <wp:docPr id="692068828" name="Picture 1"/>
+            <wp:cNvGraphicFramePr>
+              <a:graphicFrameLocks xmlns:a="http://schemas.openxmlformats.org/drawingml/2006/main" noChangeAspect="1"/>
+            </wp:cNvGraphicFramePr>
+            <a:graphic xmlns:a="http://schemas.openxmlformats.org/drawingml/2006/main">
+              <a:graphicData uri="http://schemas.openxmlformats.org/drawingml/2006/picture">
+                <pic:pic xmlns:pic="http://schemas.openxmlformats.org/drawingml/2006/picture">
+                  <pic:nvPicPr>
+                    <pic:cNvPr id="692068828" name=""/>
+                    <pic:cNvPicPr/>
+                  </pic:nvPicPr>
+                  <pic:blipFill>
+                    <a:blip r:embed="rId16"/>
+                    <a:stretch>
+                      <a:fillRect/>
+                    </a:stretch>
+                  </pic:blipFill>
+                  <pic:spPr>
+                    <a:xfrm>
+                      <a:off x="0" y="0"/>
+                      <a:ext cx="5731510" cy="3093720"/>
+                    </a:xfrm>
+                    <a:prstGeom prst="rect">
+                      <a:avLst/>
+                    </a:prstGeom>
+                  </pic:spPr>
+                </pic:pic>
+              </a:graphicData>
+            </a:graphic>
+          </wp:inline>
+        </w:drawing>
+      </w:r>
+    </w:p>
+    <w:p>
+      <w:r>
+        <w:drawing>
+          <wp:inline distT="0" distB="0" distL="0" distR="0" wp14:anchorId="2A079189" wp14:editId="5F0B6838">
+            <wp:extent cx="5731510" cy="3345180"/>
+            <wp:effectExtent l="0" t="0" r="2540" b="7620"/>
+            <wp:docPr id="1764519528" name="Picture 1"/>
+            <wp:cNvGraphicFramePr>
+              <a:graphicFrameLocks xmlns:a="http://schemas.openxmlformats.org/drawingml/2006/main" noChangeAspect="1"/>
+            </wp:cNvGraphicFramePr>
+            <a:graphic xmlns:a="http://schemas.openxmlformats.org/drawingml/2006/main">
+              <a:graphicData uri="http://schemas.openxmlformats.org/drawingml/2006/picture">
+                <pic:pic xmlns:pic="http://schemas.openxmlformats.org/drawingml/2006/picture">
+                  <pic:nvPicPr>
+                    <pic:cNvPr id="1764519528" name=""/>
+                    <pic:cNvPicPr/>
+                  </pic:nvPicPr>
+                  <pic:blipFill>
+                    <a:blip r:embed="rId17"/>
+                    <a:stretch>
+                      <a:fillRect/>
+                    </a:stretch>
+                  </pic:blipFill>
+                  <pic:spPr>
+                    <a:xfrm>
+                      <a:off x="0" y="0"/>
+                      <a:ext cx="5731510" cy="3345180"/>
+                    </a:xfrm>
+                    <a:prstGeom prst="rect">
+                      <a:avLst/>
+                    </a:prstGeom>
+                  </pic:spPr>
+                </pic:pic>
+              </a:graphicData>
+            </a:graphic>
+          </wp:inline>
+        </w:drawing>
+      </w:r>
+    </w:p>
+    <w:p>
+      <w:r>
+        <w:drawing>
+          <wp:inline distT="0" distB="0" distL="0" distR="0" wp14:anchorId="0C9AECE1" wp14:editId="40836C1E">
+            <wp:extent cx="5731510" cy="1691005"/>
+            <wp:effectExtent l="0" t="0" r="2540" b="4445"/>
+            <wp:docPr id="1560376205" name="Picture 1"/>
+            <wp:cNvGraphicFramePr>
+              <a:graphicFrameLocks xmlns:a="http://schemas.openxmlformats.org/drawingml/2006/main" noChangeAspect="1"/>
+            </wp:cNvGraphicFramePr>
+            <a:graphic xmlns:a="http://schemas.openxmlformats.org/drawingml/2006/main">
+              <a:graphicData uri="http://schemas.openxmlformats.org/drawingml/2006/picture">
+                <pic:pic xmlns:pic="http://schemas.openxmlformats.org/drawingml/2006/picture">
+                  <pic:nvPicPr>
+                    <pic:cNvPr id="1560376205" name=""/>
+                    <pic:cNvPicPr/>
+                  </pic:nvPicPr>
+                  <pic:blipFill>
+                    <a:blip r:embed="rId18"/>
+                    <a:stretch>
+                      <a:fillRect/>
+                    </a:stretch>
+                  </pic:blipFill>
+                  <pic:spPr>
+                    <a:xfrm>
+                      <a:off x="0" y="0"/>
+                      <a:ext cx="5731510" cy="1691005"/>
+                    </a:xfrm>
+                    <a:prstGeom prst="rect">
+                      <a:avLst/>
+                    </a:prstGeom>
+                  </pic:spPr>
+                </pic:pic>
+              </a:graphicData>
+            </a:graphic>
+          </wp:inline>
+        </w:drawing>
+      </w:r>
+    </w:p>
+    <w:p/>
+    <w:p>
+      <w:r>
+        <w:lastRenderedPageBreak/>
+        <w:drawing>
+          <wp:inline distT="0" distB="0" distL="0" distR="0" wp14:anchorId="473DC568" wp14:editId="43580B4E">
+            <wp:extent cx="5731510" cy="3348355"/>
+            <wp:effectExtent l="0" t="0" r="2540" b="4445"/>
+            <wp:docPr id="2015028743" name="Picture 1"/>
+            <wp:cNvGraphicFramePr>
+              <a:graphicFrameLocks xmlns:a="http://schemas.openxmlformats.org/drawingml/2006/main" noChangeAspect="1"/>
+            </wp:cNvGraphicFramePr>
+            <a:graphic xmlns:a="http://schemas.openxmlformats.org/drawingml/2006/main">
+              <a:graphicData uri="http://schemas.openxmlformats.org/drawingml/2006/picture">
+                <pic:pic xmlns:pic="http://schemas.openxmlformats.org/drawingml/2006/picture">
+                  <pic:nvPicPr>
+                    <pic:cNvPr id="2015028743" name=""/>
+                    <pic:cNvPicPr/>
+                  </pic:nvPicPr>
+                  <pic:blipFill>
+                    <a:blip r:embed="rId19"/>
+                    <a:stretch>
+                      <a:fillRect/>
+                    </a:stretch>
+                  </pic:blipFill>
+                  <pic:spPr>
+                    <a:xfrm>
+                      <a:off x="0" y="0"/>
+                      <a:ext cx="5731510" cy="3348355"/>
                     </a:xfrm>
                     <a:prstGeom prst="rect">
                       <a:avLst/>

</xml_diff>